<commit_message>
Support for Babelfish v.5.8.0 (17.12) and v.6.3.0 (18.6)
Signed-off-by: Rucha Kulkarni <ruchask@amazon.com>
</commit_message>
<xml_diff>
--- a/BabelfishCompass_UserGuide.docx
+++ b/BabelfishCompass_UserGuide.docx
@@ -1,6 +1,6 @@
 
 <file path=word/document.xml><?xml version="1.0" encoding="utf-8"?>
-<w:document xmlns:wpc="http://schemas.microsoft.com/office/word/2010/wordprocessingCanvas" xmlns:cx="http://schemas.microsoft.com/office/drawing/2014/chartex" xmlns:cx1="http://schemas.microsoft.com/office/drawing/2015/9/8/chartex" xmlns:cx2="http://schemas.microsoft.com/office/drawing/2015/10/21/chartex" xmlns:cx3="http://schemas.microsoft.com/office/drawing/2016/5/9/chartex" xmlns:cx4="http://schemas.microsoft.com/office/drawing/2016/5/10/chartex" xmlns:cx5="http://schemas.microsoft.com/office/drawing/2016/5/11/chartex" xmlns:cx6="http://schemas.microsoft.com/office/drawing/2016/5/12/chartex" xmlns:cx7="http://schemas.microsoft.com/office/drawing/2016/5/13/chartex" xmlns:cx8="http://schemas.microsoft.com/office/drawing/2016/5/14/chartex" xmlns:mc="http://schemas.openxmlformats.org/markup-compatibility/2006" xmlns:m="http://schemas.openxmlformats.org/officeDocument/2006/math" xmlns:aink="http://schemas.microsoft.com/office/drawing/2016/ink" xmlns:am3d="http://schemas.microsoft.com/office/drawing/2017/model3d" xmlns:oel="http://schemas.microsoft.com/office/2019/extlst" xmlns:r="http://schemas.openxmlformats.org/officeDocument/2006/relationships" xmlns:wp14="http://schemas.microsoft.com/office/word/2010/wordprocessingDrawing" xmlns:wp="http://schemas.openxmlformats.org/drawingml/2006/wordprocessingDrawing" xmlns:wpg="http://schemas.microsoft.com/office/word/2010/wordprocessingGroup" xmlns:wpi="http://schemas.microsoft.com/office/word/2010/wordprocessingInk" xmlns:wps="http://schemas.microsoft.com/office/word/2010/wordprocessingShape" xmlns:o="urn:schemas-microsoft-com:office:office" xmlns:v="urn:schemas-microsoft-com:vml" xmlns:w10="urn:schemas-microsoft-com:office:word" xmlns:w="http://schemas.openxmlformats.org/wordprocessingml/2006/main" xmlns:w14="http://schemas.microsoft.com/office/word/2010/wordml" xmlns:w15="http://schemas.microsoft.com/office/word/2012/wordml" xmlns:w16cei="http://schemas.microsoft.com/office/word/2026/wordml/cei" xmlns:w16cex="http://schemas.microsoft.com/office/word/2018/wordml/cex" xmlns:w16cid="http://schemas.microsoft.com/office/word/2016/wordml/cid" xmlns:w16="http://schemas.microsoft.com/office/word/2018/wordml" xmlns:w16sdtdh="http://schemas.microsoft.com/office/word/2020/wordml/sdtdatahash" xmlns:w16sdtfl="http://schemas.microsoft.com/office/word/2024/wordml/sdtformatlock" xmlns:w16se="http://schemas.microsoft.com/office/word/2015/wordml/symex" xmlns:w16du="http://schemas.microsoft.com/office/word/2023/wordml/word16du" xmlns:wne="http://schemas.microsoft.com/office/word/2006/wordml" mc:Ignorable="w14 w15 w16se w16cid w16 w16cex w16sdtdh w16sdtfl w16du wp14">
+<w:document xmlns:wpc="http://schemas.microsoft.com/office/word/2010/wordprocessingCanvas" xmlns:cx="http://schemas.microsoft.com/office/drawing/2014/chartex" xmlns:cx1="http://schemas.microsoft.com/office/drawing/2015/9/8/chartex" xmlns:cx2="http://schemas.microsoft.com/office/drawing/2015/10/21/chartex" xmlns:cx3="http://schemas.microsoft.com/office/drawing/2016/5/9/chartex" xmlns:cx4="http://schemas.microsoft.com/office/drawing/2016/5/10/chartex" xmlns:cx5="http://schemas.microsoft.com/office/drawing/2016/5/11/chartex" xmlns:cx6="http://schemas.microsoft.com/office/drawing/2016/5/12/chartex" xmlns:cx7="http://schemas.microsoft.com/office/drawing/2016/5/13/chartex" xmlns:cx8="http://schemas.microsoft.com/office/drawing/2016/5/14/chartex" xmlns:mc="http://schemas.openxmlformats.org/markup-compatibility/2006" xmlns:m="http://schemas.openxmlformats.org/officeDocument/2006/math" xmlns:aink="http://schemas.microsoft.com/office/drawing/2016/ink" xmlns:am3d="http://schemas.microsoft.com/office/drawing/2017/model3d" xmlns:oel="http://schemas.microsoft.com/office/2019/extlst" xmlns:r="http://schemas.openxmlformats.org/officeDocument/2006/relationships" xmlns:wp14="http://schemas.microsoft.com/office/word/2010/wordprocessingDrawing" xmlns:wp="http://schemas.openxmlformats.org/drawingml/2006/wordprocessingDrawing" xmlns:wpg="http://schemas.microsoft.com/office/word/2010/wordprocessingGroup" xmlns:wpi="http://schemas.microsoft.com/office/word/2010/wordprocessingInk" xmlns:wps="http://schemas.microsoft.com/office/word/2010/wordprocessingShape" xmlns:o="urn:schemas-microsoft-com:office:office" xmlns:v="urn:schemas-microsoft-com:vml" xmlns:w10="urn:schemas-microsoft-com:office:word" xmlns:w="http://schemas.openxmlformats.org/wordprocessingml/2006/main" xmlns:w14="http://schemas.microsoft.com/office/word/2010/wordml" xmlns:w15="http://schemas.microsoft.com/office/word/2012/wordml" xmlns:w16cex="http://schemas.microsoft.com/office/word/2018/wordml/cex" xmlns:w16cid="http://schemas.microsoft.com/office/word/2016/wordml/cid" xmlns:w16="http://schemas.microsoft.com/office/word/2018/wordml" xmlns:w16sdtdh="http://schemas.microsoft.com/office/word/2020/wordml/sdtdatahash" xmlns:w16sdtfl="http://schemas.microsoft.com/office/word/2024/wordml/sdtformatlock" xmlns:w16se="http://schemas.microsoft.com/office/word/2015/wordml/symex" xmlns:w16du="http://schemas.microsoft.com/office/word/2023/wordml/word16du" xmlns:wne="http://schemas.microsoft.com/office/word/2006/wordml" mc:Ignorable="w14 w15 w16se w16cid w16 w16cex w16sdtdh w16sdtfl w16du wp14">
   <w:body>
     <w:p>
       <w:pPr>
@@ -1767,7 +1767,7 @@
             <w:noProof/>
             <w:webHidden/>
           </w:rPr>
-          <w:t>10</w:t>
+          <w:t>11</w:t>
         </w:r>
         <w:r>
           <w:rPr>
@@ -1910,7 +1910,7 @@
             <w:noProof/>
             <w:webHidden/>
           </w:rPr>
-          <w:t>16</w:t>
+          <w:t>17</w:t>
         </w:r>
         <w:r>
           <w:rPr>
@@ -5858,6 +5858,115 @@
           <w:p>
             <w:pPr>
               <w:pStyle w:val="BodyText"/>
+              <w:tabs>
+                <w:tab w:val="left" w:pos="1000"/>
+              </w:tabs>
+              <w:rPr>
+                <w:b/>
+              </w:rPr>
+            </w:pPr>
+            <w:r>
+              <w:rPr>
+                <w:bCs/>
+              </w:rPr>
+              <w:t>2026-</w:t>
+            </w:r>
+            <w:r>
+              <w:rPr>
+                <w:bCs/>
+              </w:rPr>
+              <w:t>12</w:t>
+            </w:r>
+          </w:p>
+        </w:tc>
+        <w:tc>
+          <w:tcPr>
+            <w:tcW w:w="6237" w:type="dxa"/>
+          </w:tcPr>
+          <w:p>
+            <w:pPr>
+              <w:pStyle w:val="BodyText"/>
+              <w:rPr>
+                <w:b/>
+              </w:rPr>
+            </w:pPr>
+            <w:r>
+              <w:rPr>
+                <w:bCs/>
+              </w:rPr>
+              <w:t>5.</w:t>
+            </w:r>
+            <w:r>
+              <w:rPr>
+                <w:bCs/>
+              </w:rPr>
+              <w:t>8</w:t>
+            </w:r>
+            <w:r>
+              <w:rPr>
+                <w:bCs/>
+              </w:rPr>
+              <w:t>.x (PG 17.</w:t>
+            </w:r>
+            <w:r>
+              <w:rPr>
+                <w:bCs/>
+              </w:rPr>
+              <w:t>1</w:t>
+            </w:r>
+            <w:r>
+              <w:rPr>
+                <w:bCs/>
+              </w:rPr>
+              <w:t>2</w:t>
+            </w:r>
+            <w:r>
+              <w:rPr>
+                <w:bCs/>
+              </w:rPr>
+              <w:t>)</w:t>
+            </w:r>
+            <w:r>
+              <w:rPr>
+                <w:bCs/>
+              </w:rPr>
+              <w:t>, 6.</w:t>
+            </w:r>
+            <w:r>
+              <w:rPr>
+                <w:bCs/>
+              </w:rPr>
+              <w:t>3</w:t>
+            </w:r>
+            <w:r>
+              <w:rPr>
+                <w:bCs/>
+              </w:rPr>
+              <w:t>.x (PG 18.</w:t>
+            </w:r>
+            <w:r>
+              <w:rPr>
+                <w:bCs/>
+              </w:rPr>
+              <w:t>6</w:t>
+            </w:r>
+            <w:r>
+              <w:rPr>
+                <w:bCs/>
+              </w:rPr>
+              <w:t>)</w:t>
+            </w:r>
+          </w:p>
+        </w:tc>
+      </w:tr>
+      <w:tr>
+        <w:tc>
+          <w:tcPr>
+            <w:tcW w:w="3397" w:type="dxa"/>
+          </w:tcPr>
+          <w:p>
+            <w:pPr>
+              <w:pStyle w:val="BodyText"/>
               <w:rPr>
                 <w:bCs/>
               </w:rPr>
@@ -5903,13 +6012,7 @@
               <w:rPr>
                 <w:bCs/>
               </w:rPr>
-              <w:t>1</w:t>
-            </w:r>
-            <w:r>
-              <w:rPr>
-                <w:bCs/>
-              </w:rPr>
-              <w:t>1</w:t>
+              <w:t>11</w:t>
             </w:r>
             <w:r>
               <w:rPr>
@@ -5921,31 +6024,7 @@
               <w:rPr>
                 <w:bCs/>
               </w:rPr>
-              <w:t>, 6.</w:t>
-            </w:r>
-            <w:r>
-              <w:rPr>
-                <w:bCs/>
-              </w:rPr>
-              <w:t>2</w:t>
-            </w:r>
-            <w:r>
-              <w:rPr>
-                <w:bCs/>
-              </w:rPr>
-              <w:t>.x (PG 18.</w:t>
-            </w:r>
-            <w:r>
-              <w:rPr>
-                <w:bCs/>
-              </w:rPr>
-              <w:t>5</w:t>
-            </w:r>
-            <w:r>
-              <w:rPr>
-                <w:bCs/>
-              </w:rPr>
-              <w:t>)</w:t>
+              <w:t>, 6.2.x (PG 18.5)</w:t>
             </w:r>
           </w:p>
         </w:tc>
@@ -6556,6 +6635,7 @@
               <w:pStyle w:val="BodyText"/>
             </w:pPr>
             <w:r>
+              <w:lastRenderedPageBreak/>
               <w:t>2022-09, 2022-10, 2022-11</w:t>
             </w:r>
           </w:p>
@@ -6584,7 +6664,6 @@
               <w:pStyle w:val="BodyText"/>
             </w:pPr>
             <w:r>
-              <w:lastRenderedPageBreak/>
               <w:t>2022-07, 2022-06[-a]</w:t>
             </w:r>
           </w:p>
@@ -7243,6 +7322,7 @@
         <w:pStyle w:val="BodyText"/>
       </w:pPr>
       <w:r>
+        <w:lastRenderedPageBreak/>
         <w:t>Installation steps on Windows:</w:t>
       </w:r>
     </w:p>
@@ -7255,7 +7335,6 @@
         </w:numPr>
       </w:pPr>
       <w:r>
-        <w:lastRenderedPageBreak/>
         <w:t xml:space="preserve">Download the </w:t>
       </w:r>
       <w:bookmarkStart w:id="7" w:name="_Hlk85581432"/>
@@ -8018,6 +8097,7 @@
         <w:pStyle w:val="BodyText"/>
       </w:pPr>
       <w:r>
+        <w:lastRenderedPageBreak/>
         <w:t>Then</w:t>
       </w:r>
       <w:r>
@@ -8089,7 +8169,6 @@
           <w:b/>
           <w:bCs/>
         </w:rPr>
-        <w:lastRenderedPageBreak/>
         <w:t>C:\BabelfishCompass</w:t>
       </w:r>
       <w:proofErr w:type="gramStart"/>
@@ -8842,7 +8921,11 @@
       </w:r>
       <w:proofErr w:type="spellEnd"/>
       <w:r>
-        <w:t xml:space="preserve"> for the analyzed SQL Server script(s).  In the simplest</w:t>
+        <w:t xml:space="preserve"> </w:t>
+      </w:r>
+      <w:r>
+        <w:lastRenderedPageBreak/>
+        <w:t>for the analyzed SQL Server script(s).  In the simplest</w:t>
       </w:r>
       <w:r>
         <w:t xml:space="preserve"> usage</w:t>
@@ -8887,7 +8970,6 @@
         <w:rPr>
           <w:b/>
         </w:rPr>
-        <w:lastRenderedPageBreak/>
         <w:t>$</w:t>
       </w:r>
       <w:r>
@@ -9634,6 +9716,7 @@
           <w:b/>
           <w:bCs/>
         </w:rPr>
+        <w:lastRenderedPageBreak/>
         <w:t>BabelfishCompass</w:t>
       </w:r>
       <w:proofErr w:type="spellEnd"/>
@@ -9710,7 +9793,6 @@
         </w:rPr>
       </w:pPr>
       <w:r>
-        <w:lastRenderedPageBreak/>
         <w:br/>
       </w:r>
       <w:r>
@@ -10562,6 +10644,7 @@
         <w:pStyle w:val="BodyText"/>
       </w:pPr>
       <w:r>
+        <w:lastRenderedPageBreak/>
         <w:t xml:space="preserve">The initial GA version of </w:t>
       </w:r>
       <w:proofErr w:type="spellStart"/>
@@ -11392,6 +11475,7 @@
         <w:rPr>
           <w:b/>
         </w:rPr>
+        <w:lastRenderedPageBreak/>
         <w:t>-</w:t>
       </w:r>
       <w:proofErr w:type="spellStart"/>
@@ -11458,7 +11542,6 @@
         <w:rPr>
           <w:b/>
         </w:rPr>
-        <w:lastRenderedPageBreak/>
         <w:t>-</w:t>
       </w:r>
       <w:proofErr w:type="spellStart"/>
@@ -12227,7 +12310,11 @@
       </w:r>
       <w:proofErr w:type="spellEnd"/>
       <w:r>
-        <w:t xml:space="preserve"> flags. The cross-reference is not generated by default, as this potentially makes the assessment report very long.</w:t>
+        <w:t xml:space="preserve"> flags. The cross-reference is not generated by default, as this </w:t>
+      </w:r>
+      <w:r>
+        <w:lastRenderedPageBreak/>
+        <w:t>potentially makes the assessment report very long.</w:t>
       </w:r>
       <w:r>
         <w:br/>
@@ -12255,7 +12342,6 @@
         <w:rPr>
           <w:b/>
         </w:rPr>
-        <w:lastRenderedPageBreak/>
         <w:t>xref</w:t>
       </w:r>
       <w:proofErr w:type="spellEnd"/>
@@ -12717,6 +12803,7 @@
         <w:rPr>
           <w:b/>
         </w:rPr>
+        <w:lastRenderedPageBreak/>
         <w:t>notabs</w:t>
       </w:r>
       <w:proofErr w:type="spellEnd"/>
@@ -12783,7 +12870,6 @@
         <w:rPr>
           <w:b/>
         </w:rPr>
-        <w:lastRenderedPageBreak/>
         <w:t>apps</w:t>
       </w:r>
       <w:r>
@@ -13465,6 +13551,7 @@
         <w:rPr>
           <w:b/>
         </w:rPr>
+        <w:lastRenderedPageBreak/>
         <w:t>-</w:t>
       </w:r>
       <w:r>
@@ -13592,7 +13679,6 @@
         <w:rPr>
           <w:b/>
         </w:rPr>
-        <w:lastRenderedPageBreak/>
         <w:t>-</w:t>
       </w:r>
       <w:proofErr w:type="gramStart"/>
@@ -14248,6 +14334,7 @@
         <w:pStyle w:val="BodyText"/>
       </w:pPr>
       <w:r>
+        <w:lastRenderedPageBreak/>
         <w:t xml:space="preserve">Generate a report for applications </w:t>
       </w:r>
       <w:r>
@@ -15532,7 +15619,6 @@
         </w:numPr>
       </w:pPr>
       <w:r>
-        <w:lastRenderedPageBreak/>
         <w:t xml:space="preserve">When not specifying the </w:t>
       </w:r>
       <w:r>
@@ -19549,13 +19635,27 @@
         <w:rPr>
           <w:rFonts w:asciiTheme="minorHAnsi" w:hAnsiTheme="minorHAnsi" w:cstheme="minorHAnsi"/>
         </w:rPr>
-        <w:t>FILEGROUP_NAME</w:t>
-      </w:r>
+        <w:t>FILEGROUP_</w:t>
+      </w:r>
+      <w:proofErr w:type="gramStart"/>
       <w:r>
         <w:rPr>
           <w:rFonts w:asciiTheme="minorHAnsi" w:hAnsiTheme="minorHAnsi" w:cstheme="minorHAnsi"/>
         </w:rPr>
-        <w:t>().</w:t>
+        <w:t>NAME</w:t>
+      </w:r>
+      <w:r>
+        <w:rPr>
+          <w:rFonts w:asciiTheme="minorHAnsi" w:hAnsiTheme="minorHAnsi" w:cstheme="minorHAnsi"/>
+        </w:rPr>
+        <w:t>(</w:t>
+      </w:r>
+      <w:proofErr w:type="gramEnd"/>
+      <w:r>
+        <w:rPr>
+          <w:rFonts w:asciiTheme="minorHAnsi" w:hAnsiTheme="minorHAnsi" w:cstheme="minorHAnsi"/>
+        </w:rPr>
+        <w:t>).</w:t>
       </w:r>
       <w:r>
         <w:rPr>
@@ -22368,6 +22468,7 @@
       <w:r>
         <w:t xml:space="preserve">), and the second is the corresponding number of minutes, for calculation purposes (e.g. </w:t>
       </w:r>
+      <w:proofErr w:type="gramStart"/>
       <w:r>
         <w:rPr>
           <w:b/>
@@ -22375,8 +22476,13 @@
         <w:t>5</w:t>
       </w:r>
       <w:r>
-        <w:t xml:space="preserve"> , </w:t>
-      </w:r>
+        <w:t xml:space="preserve"> ,</w:t>
+      </w:r>
+      <w:proofErr w:type="gramEnd"/>
+      <w:r>
+        <w:t xml:space="preserve"> </w:t>
+      </w:r>
+      <w:proofErr w:type="gramStart"/>
       <w:r>
         <w:rPr>
           <w:b/>
@@ -22390,7 +22496,14 @@
         <w:rPr>
           <w:b/>
         </w:rPr>
-        <w:t xml:space="preserve">  480 </w:t>
+        <w:t xml:space="preserve">  480</w:t>
+      </w:r>
+      <w:proofErr w:type="gramEnd"/>
+      <w:r>
+        <w:rPr>
+          <w:b/>
+        </w:rPr>
+        <w:t xml:space="preserve"> </w:t>
       </w:r>
       <w:r>
         <w:t>minutes, respectively</w:t>
@@ -22485,15 +22598,7 @@
       </w:pPr>
       <w:bookmarkStart w:id="48" w:name="_Toc184660762"/>
       <w:r>
-        <w:t xml:space="preserve">Real-life effort </w:t>
-      </w:r>
-      <w:proofErr w:type="gramStart"/>
-      <w:r>
-        <w:t>estimate</w:t>
-      </w:r>
-      <w:proofErr w:type="gramEnd"/>
-      <w:r>
-        <w:t xml:space="preserve"> in executive summary</w:t>
+        <w:t>Real-life effort estimate in executive summary</w:t>
       </w:r>
       <w:bookmarkEnd w:id="48"/>
     </w:p>
@@ -22591,7 +22696,15 @@
         <w:t xml:space="preserve">calculation of weeks/days </w:t>
       </w:r>
       <w:r>
-        <w:t xml:space="preserve">is intended to provide a rough real-life, order-of-magnitude indication of the level of human effort required. Please note that this number is derived from the user's own effort estimate definitions. Compass is not providing such estimates itself. Interpreting and validating these effort numbers are the exclusive responsibility of the Compass user. </w:t>
+        <w:t xml:space="preserve">is intended to provide a rough real-life, order-of-magnitude indication of the level of human effort required. Please note that this number is derived from the user's own effort estimate definitions. Compass is not providing such estimates itself. Interpreting and validating </w:t>
+      </w:r>
+      <w:proofErr w:type="gramStart"/>
+      <w:r>
+        <w:t>these effort</w:t>
+      </w:r>
+      <w:proofErr w:type="gramEnd"/>
+      <w:r>
+        <w:t xml:space="preserve"> numbers are the exclusive responsibility of the Compass user. </w:t>
       </w:r>
       <w:r>
         <w:br/>
@@ -23142,21 +23255,7 @@
         <w:rPr>
           <w:rStyle w:val="Heading2Char"/>
         </w:rPr>
-        <w:t xml:space="preserve">Effort </w:t>
-      </w:r>
-      <w:proofErr w:type="gramStart"/>
-      <w:r>
-        <w:rPr>
-          <w:rStyle w:val="Heading2Char"/>
-        </w:rPr>
-        <w:t>estimate</w:t>
-      </w:r>
-      <w:proofErr w:type="gramEnd"/>
-      <w:r>
-        <w:rPr>
-          <w:rStyle w:val="Heading2Char"/>
-        </w:rPr>
-        <w:t xml:space="preserve"> defaults</w:t>
+        <w:t>Effort estimate defaults</w:t>
       </w:r>
       <w:bookmarkEnd w:id="50"/>
       <w:r>
@@ -23542,21 +23641,7 @@
         <w:rPr>
           <w:b/>
         </w:rPr>
-        <w:t xml:space="preserve"># </w:t>
-      </w:r>
-      <w:proofErr w:type="gramStart"/>
-      <w:r>
-        <w:rPr>
-          <w:b/>
-        </w:rPr>
-        <w:t>these effort</w:t>
-      </w:r>
-      <w:proofErr w:type="gramEnd"/>
-      <w:r>
-        <w:rPr>
-          <w:b/>
-        </w:rPr>
-        <w:t xml:space="preserve"> estimate values are arbitrary examples; do not copy!</w:t>
+        <w:t># these effort estimate values are arbitrary examples; do not copy!</w:t>
       </w:r>
     </w:p>
     <w:p>
@@ -27070,14 +27155,46 @@
           <w:rFonts w:ascii="Courier New" w:hAnsi="Courier New" w:cs="Courier New"/>
           <w:sz w:val="22"/>
         </w:rPr>
-        <w:t xml:space="preserve">select substring(item from E'^(.+?)(\\W|$)') as </w:t>
-      </w:r>
-      <w:proofErr w:type="spellStart"/>
+        <w:t xml:space="preserve">select </w:t>
+      </w:r>
+      <w:proofErr w:type="gramStart"/>
       <w:r>
         <w:rPr>
           <w:rFonts w:ascii="Courier New" w:hAnsi="Courier New" w:cs="Courier New"/>
           <w:sz w:val="22"/>
         </w:rPr>
+        <w:t>substring(</w:t>
+      </w:r>
+      <w:proofErr w:type="gramEnd"/>
+      <w:r>
+        <w:rPr>
+          <w:rFonts w:ascii="Courier New" w:hAnsi="Courier New" w:cs="Courier New"/>
+          <w:sz w:val="22"/>
+        </w:rPr>
+        <w:t>item from E'^</w:t>
+      </w:r>
+      <w:proofErr w:type="gramStart"/>
+      <w:r>
+        <w:rPr>
+          <w:rFonts w:ascii="Courier New" w:hAnsi="Courier New" w:cs="Courier New"/>
+          <w:sz w:val="22"/>
+        </w:rPr>
+        <w:t>(.+?)(</w:t>
+      </w:r>
+      <w:proofErr w:type="gramEnd"/>
+      <w:r>
+        <w:rPr>
+          <w:rFonts w:ascii="Courier New" w:hAnsi="Courier New" w:cs="Courier New"/>
+          <w:sz w:val="22"/>
+        </w:rPr>
+        <w:t xml:space="preserve">\\W|$)') as </w:t>
+      </w:r>
+      <w:proofErr w:type="spellStart"/>
+      <w:r>
+        <w:rPr>
+          <w:rFonts w:ascii="Courier New" w:hAnsi="Courier New" w:cs="Courier New"/>
+          <w:sz w:val="22"/>
+        </w:rPr>
         <w:t>DMLStatement</w:t>
       </w:r>
       <w:proofErr w:type="spellEnd"/>
@@ -27118,14 +27235,46 @@
           <w:rFonts w:ascii="Courier New" w:hAnsi="Courier New" w:cs="Courier New"/>
           <w:sz w:val="22"/>
         </w:rPr>
-        <w:t xml:space="preserve">, substring(item from E'^(.+?)(\\W|$)') as </w:t>
-      </w:r>
-      <w:proofErr w:type="spellStart"/>
+        <w:t xml:space="preserve">, </w:t>
+      </w:r>
+      <w:proofErr w:type="gramStart"/>
       <w:r>
         <w:rPr>
           <w:rFonts w:ascii="Courier New" w:hAnsi="Courier New" w:cs="Courier New"/>
           <w:sz w:val="22"/>
         </w:rPr>
+        <w:t>substring(</w:t>
+      </w:r>
+      <w:proofErr w:type="gramEnd"/>
+      <w:r>
+        <w:rPr>
+          <w:rFonts w:ascii="Courier New" w:hAnsi="Courier New" w:cs="Courier New"/>
+          <w:sz w:val="22"/>
+        </w:rPr>
+        <w:t>item from E'^</w:t>
+      </w:r>
+      <w:proofErr w:type="gramStart"/>
+      <w:r>
+        <w:rPr>
+          <w:rFonts w:ascii="Courier New" w:hAnsi="Courier New" w:cs="Courier New"/>
+          <w:sz w:val="22"/>
+        </w:rPr>
+        <w:t>(.+?)(</w:t>
+      </w:r>
+      <w:proofErr w:type="gramEnd"/>
+      <w:r>
+        <w:rPr>
+          <w:rFonts w:ascii="Courier New" w:hAnsi="Courier New" w:cs="Courier New"/>
+          <w:sz w:val="22"/>
+        </w:rPr>
+        <w:t xml:space="preserve">\\W|$)') as </w:t>
+      </w:r>
+      <w:proofErr w:type="spellStart"/>
+      <w:r>
+        <w:rPr>
+          <w:rFonts w:ascii="Courier New" w:hAnsi="Courier New" w:cs="Courier New"/>
+          <w:sz w:val="22"/>
+        </w:rPr>
         <w:t>accesstype</w:t>
       </w:r>
       <w:proofErr w:type="spellEnd"/>
@@ -27137,6 +27286,7 @@
         <w:t xml:space="preserve">, context from </w:t>
       </w:r>
       <w:proofErr w:type="spellStart"/>
+      <w:proofErr w:type="gramStart"/>
       <w:r>
         <w:rPr>
           <w:rFonts w:ascii="Courier New" w:hAnsi="Courier New" w:cs="Courier New"/>
@@ -27145,12 +27295,45 @@
         <w:t>public.BBFCompass</w:t>
       </w:r>
       <w:proofErr w:type="spellEnd"/>
+      <w:proofErr w:type="gramEnd"/>
       <w:r>
         <w:rPr>
           <w:rFonts w:ascii="Courier New" w:hAnsi="Courier New" w:cs="Courier New"/>
           <w:sz w:val="22"/>
         </w:rPr>
-        <w:t xml:space="preserve"> where item similar to '(INSERT|UPDATE|DELETE|MERGE)%' and item not like '%(target)%' and item not like '%@</w:t>
+        <w:t xml:space="preserve"> where item similar to '(INSERT|UPDATE|DELETE|</w:t>
+      </w:r>
+      <w:proofErr w:type="gramStart"/>
+      <w:r>
+        <w:rPr>
+          <w:rFonts w:ascii="Courier New" w:hAnsi="Courier New" w:cs="Courier New"/>
+          <w:sz w:val="22"/>
+        </w:rPr>
+        <w:t>MERGE)%</w:t>
+      </w:r>
+      <w:proofErr w:type="gramEnd"/>
+      <w:r>
+        <w:rPr>
+          <w:rFonts w:ascii="Courier New" w:hAnsi="Courier New" w:cs="Courier New"/>
+          <w:sz w:val="22"/>
+        </w:rPr>
+        <w:t xml:space="preserve">' and item </w:t>
+      </w:r>
+      <w:proofErr w:type="gramStart"/>
+      <w:r>
+        <w:rPr>
+          <w:rFonts w:ascii="Courier New" w:hAnsi="Courier New" w:cs="Courier New"/>
+          <w:sz w:val="22"/>
+        </w:rPr>
+        <w:t>not like</w:t>
+      </w:r>
+      <w:proofErr w:type="gramEnd"/>
+      <w:r>
+        <w:rPr>
+          <w:rFonts w:ascii="Courier New" w:hAnsi="Courier New" w:cs="Courier New"/>
+          <w:sz w:val="22"/>
+        </w:rPr>
+        <w:t xml:space="preserve"> '%(target)%' and item not like '%@</w:t>
       </w:r>
       <w:proofErr w:type="spellStart"/>
       <w:r>
@@ -27651,6 +27834,7 @@
         <w:t xml:space="preserve">, context from </w:t>
       </w:r>
       <w:proofErr w:type="spellStart"/>
+      <w:proofErr w:type="gramStart"/>
       <w:r>
         <w:rPr>
           <w:rFonts w:ascii="Courier New" w:hAnsi="Courier New" w:cs="Courier New"/>
@@ -27659,6 +27843,7 @@
         <w:t>public.BBFCompass</w:t>
       </w:r>
       <w:proofErr w:type="spellEnd"/>
+      <w:proofErr w:type="gramEnd"/>
       <w:r>
         <w:rPr>
           <w:rFonts w:ascii="Courier New" w:hAnsi="Courier New" w:cs="Courier New"/>
@@ -27680,7 +27865,23 @@
           <w:rFonts w:ascii="Courier New" w:hAnsi="Courier New" w:cs="Courier New"/>
           <w:sz w:val="22"/>
         </w:rPr>
-        <w:t xml:space="preserve"> = 'DDL' and item not like 'Option %' and item not like 'Constraint %' and item </w:t>
+        <w:t xml:space="preserve"> = 'DDL' and item </w:t>
+      </w:r>
+      <w:proofErr w:type="gramStart"/>
+      <w:r>
+        <w:rPr>
+          <w:rFonts w:ascii="Courier New" w:hAnsi="Courier New" w:cs="Courier New"/>
+          <w:sz w:val="22"/>
+        </w:rPr>
+        <w:t>not like</w:t>
+      </w:r>
+      <w:proofErr w:type="gramEnd"/>
+      <w:r>
+        <w:rPr>
+          <w:rFonts w:ascii="Courier New" w:hAnsi="Courier New" w:cs="Courier New"/>
+          <w:sz w:val="22"/>
+        </w:rPr>
+        <w:t xml:space="preserve"> 'Option %' and item not like 'Constraint %' and item </w:t>
       </w:r>
       <w:r>
         <w:rPr>
@@ -33975,7 +34176,15 @@
       </w:r>
       <w:proofErr w:type="spellEnd"/>
       <w:r>
-        <w:t xml:space="preserve"> works best when Compass is located close to the SQL Server from a network proximity perspective, since the process requires many client/server round trips.</w:t>
+        <w:t xml:space="preserve"> works best when Compass is located close to the SQL Server from a network proximity perspective, since the process requires many client/</w:t>
+      </w:r>
+      <w:proofErr w:type="gramStart"/>
+      <w:r>
+        <w:t>server</w:t>
+      </w:r>
+      <w:proofErr w:type="gramEnd"/>
+      <w:r>
+        <w:t xml:space="preserve"> round trips.</w:t>
       </w:r>
     </w:p>
     <w:p>
@@ -38001,7 +38210,7 @@
 </file>
 
 <file path=word/endnotes.xml><?xml version="1.0" encoding="utf-8"?>
-<w:endnotes xmlns:wpc="http://schemas.microsoft.com/office/word/2010/wordprocessingCanvas" xmlns:cx="http://schemas.microsoft.com/office/drawing/2014/chartex" xmlns:cx1="http://schemas.microsoft.com/office/drawing/2015/9/8/chartex" xmlns:cx2="http://schemas.microsoft.com/office/drawing/2015/10/21/chartex" xmlns:cx3="http://schemas.microsoft.com/office/drawing/2016/5/9/chartex" xmlns:cx4="http://schemas.microsoft.com/office/drawing/2016/5/10/chartex" xmlns:cx5="http://schemas.microsoft.com/office/drawing/2016/5/11/chartex" xmlns:cx6="http://schemas.microsoft.com/office/drawing/2016/5/12/chartex" xmlns:cx7="http://schemas.microsoft.com/office/drawing/2016/5/13/chartex" xmlns:cx8="http://schemas.microsoft.com/office/drawing/2016/5/14/chartex" xmlns:mc="http://schemas.openxmlformats.org/markup-compatibility/2006" xmlns:m="http://schemas.openxmlformats.org/officeDocument/2006/math" xmlns:aink="http://schemas.microsoft.com/office/drawing/2016/ink" xmlns:am3d="http://schemas.microsoft.com/office/drawing/2017/model3d" xmlns:oel="http://schemas.microsoft.com/office/2019/extlst" xmlns:r="http://schemas.openxmlformats.org/officeDocument/2006/relationships" xmlns:wp14="http://schemas.microsoft.com/office/word/2010/wordprocessingDrawing" xmlns:wp="http://schemas.openxmlformats.org/drawingml/2006/wordprocessingDrawing" xmlns:wpg="http://schemas.microsoft.com/office/word/2010/wordprocessingGroup" xmlns:wpi="http://schemas.microsoft.com/office/word/2010/wordprocessingInk" xmlns:wps="http://schemas.microsoft.com/office/word/2010/wordprocessingShape" xmlns:o="urn:schemas-microsoft-com:office:office" xmlns:v="urn:schemas-microsoft-com:vml" xmlns:w10="urn:schemas-microsoft-com:office:word" xmlns:w="http://schemas.openxmlformats.org/wordprocessingml/2006/main" xmlns:w14="http://schemas.microsoft.com/office/word/2010/wordml" xmlns:w15="http://schemas.microsoft.com/office/word/2012/wordml" xmlns:w16cei="http://schemas.microsoft.com/office/word/2026/wordml/cei" xmlns:w16cex="http://schemas.microsoft.com/office/word/2018/wordml/cex" xmlns:w16cid="http://schemas.microsoft.com/office/word/2016/wordml/cid" xmlns:w16="http://schemas.microsoft.com/office/word/2018/wordml" xmlns:w16sdtdh="http://schemas.microsoft.com/office/word/2020/wordml/sdtdatahash" xmlns:w16sdtfl="http://schemas.microsoft.com/office/word/2024/wordml/sdtformatlock" xmlns:w16se="http://schemas.microsoft.com/office/word/2015/wordml/symex" xmlns:w16du="http://schemas.microsoft.com/office/word/2023/wordml/word16du" xmlns:wne="http://schemas.microsoft.com/office/word/2006/wordml" mc:Ignorable="w14 w15 w16se w16cid w16 w16cex w16sdtdh w16sdtfl w16du wp14">
+<w:endnotes xmlns:wpc="http://schemas.microsoft.com/office/word/2010/wordprocessingCanvas" xmlns:cx="http://schemas.microsoft.com/office/drawing/2014/chartex" xmlns:cx1="http://schemas.microsoft.com/office/drawing/2015/9/8/chartex" xmlns:cx2="http://schemas.microsoft.com/office/drawing/2015/10/21/chartex" xmlns:cx3="http://schemas.microsoft.com/office/drawing/2016/5/9/chartex" xmlns:cx4="http://schemas.microsoft.com/office/drawing/2016/5/10/chartex" xmlns:cx5="http://schemas.microsoft.com/office/drawing/2016/5/11/chartex" xmlns:cx6="http://schemas.microsoft.com/office/drawing/2016/5/12/chartex" xmlns:cx7="http://schemas.microsoft.com/office/drawing/2016/5/13/chartex" xmlns:cx8="http://schemas.microsoft.com/office/drawing/2016/5/14/chartex" xmlns:mc="http://schemas.openxmlformats.org/markup-compatibility/2006" xmlns:m="http://schemas.openxmlformats.org/officeDocument/2006/math" xmlns:aink="http://schemas.microsoft.com/office/drawing/2016/ink" xmlns:am3d="http://schemas.microsoft.com/office/drawing/2017/model3d" xmlns:oel="http://schemas.microsoft.com/office/2019/extlst" xmlns:r="http://schemas.openxmlformats.org/officeDocument/2006/relationships" xmlns:wp14="http://schemas.microsoft.com/office/word/2010/wordprocessingDrawing" xmlns:wp="http://schemas.openxmlformats.org/drawingml/2006/wordprocessingDrawing" xmlns:wpg="http://schemas.microsoft.com/office/word/2010/wordprocessingGroup" xmlns:wpi="http://schemas.microsoft.com/office/word/2010/wordprocessingInk" xmlns:wps="http://schemas.microsoft.com/office/word/2010/wordprocessingShape" xmlns:o="urn:schemas-microsoft-com:office:office" xmlns:v="urn:schemas-microsoft-com:vml" xmlns:w10="urn:schemas-microsoft-com:office:word" xmlns:w="http://schemas.openxmlformats.org/wordprocessingml/2006/main" xmlns:w14="http://schemas.microsoft.com/office/word/2010/wordml" xmlns:w15="http://schemas.microsoft.com/office/word/2012/wordml" xmlns:w16cex="http://schemas.microsoft.com/office/word/2018/wordml/cex" xmlns:w16cid="http://schemas.microsoft.com/office/word/2016/wordml/cid" xmlns:w16="http://schemas.microsoft.com/office/word/2018/wordml" xmlns:w16sdtdh="http://schemas.microsoft.com/office/word/2020/wordml/sdtdatahash" xmlns:w16sdtfl="http://schemas.microsoft.com/office/word/2024/wordml/sdtformatlock" xmlns:w16se="http://schemas.microsoft.com/office/word/2015/wordml/symex" xmlns:w16du="http://schemas.microsoft.com/office/word/2023/wordml/word16du" xmlns:wne="http://schemas.microsoft.com/office/word/2006/wordml" mc:Ignorable="w14 w15 w16se w16cid w16 w16cex w16sdtdh w16sdtfl w16du wp14">
   <w:endnote w:type="separator" w:id="-1">
     <w:p>
       <w:r>
@@ -38020,7 +38229,7 @@
 </file>
 
 <file path=word/footer1.xml><?xml version="1.0" encoding="utf-8"?>
-<w:ftr xmlns:wpc="http://schemas.microsoft.com/office/word/2010/wordprocessingCanvas" xmlns:cx="http://schemas.microsoft.com/office/drawing/2014/chartex" xmlns:cx1="http://schemas.microsoft.com/office/drawing/2015/9/8/chartex" xmlns:cx2="http://schemas.microsoft.com/office/drawing/2015/10/21/chartex" xmlns:cx3="http://schemas.microsoft.com/office/drawing/2016/5/9/chartex" xmlns:cx4="http://schemas.microsoft.com/office/drawing/2016/5/10/chartex" xmlns:cx5="http://schemas.microsoft.com/office/drawing/2016/5/11/chartex" xmlns:cx6="http://schemas.microsoft.com/office/drawing/2016/5/12/chartex" xmlns:cx7="http://schemas.microsoft.com/office/drawing/2016/5/13/chartex" xmlns:cx8="http://schemas.microsoft.com/office/drawing/2016/5/14/chartex" xmlns:mc="http://schemas.openxmlformats.org/markup-compatibility/2006" xmlns:m="http://schemas.openxmlformats.org/officeDocument/2006/math" xmlns:aink="http://schemas.microsoft.com/office/drawing/2016/ink" xmlns:am3d="http://schemas.microsoft.com/office/drawing/2017/model3d" xmlns:oel="http://schemas.microsoft.com/office/2019/extlst" xmlns:r="http://schemas.openxmlformats.org/officeDocument/2006/relationships" xmlns:wp14="http://schemas.microsoft.com/office/word/2010/wordprocessingDrawing" xmlns:wp="http://schemas.openxmlformats.org/drawingml/2006/wordprocessingDrawing" xmlns:wpg="http://schemas.microsoft.com/office/word/2010/wordprocessingGroup" xmlns:wpi="http://schemas.microsoft.com/office/word/2010/wordprocessingInk" xmlns:wps="http://schemas.microsoft.com/office/word/2010/wordprocessingShape" xmlns:o="urn:schemas-microsoft-com:office:office" xmlns:v="urn:schemas-microsoft-com:vml" xmlns:w10="urn:schemas-microsoft-com:office:word" xmlns:w="http://schemas.openxmlformats.org/wordprocessingml/2006/main" xmlns:w14="http://schemas.microsoft.com/office/word/2010/wordml" xmlns:w15="http://schemas.microsoft.com/office/word/2012/wordml" xmlns:w16cei="http://schemas.microsoft.com/office/word/2026/wordml/cei" xmlns:w16cex="http://schemas.microsoft.com/office/word/2018/wordml/cex" xmlns:w16cid="http://schemas.microsoft.com/office/word/2016/wordml/cid" xmlns:w16="http://schemas.microsoft.com/office/word/2018/wordml" xmlns:w16sdtdh="http://schemas.microsoft.com/office/word/2020/wordml/sdtdatahash" xmlns:w16sdtfl="http://schemas.microsoft.com/office/word/2024/wordml/sdtformatlock" xmlns:w16se="http://schemas.microsoft.com/office/word/2015/wordml/symex" xmlns:w16du="http://schemas.microsoft.com/office/word/2023/wordml/word16du" xmlns:wne="http://schemas.microsoft.com/office/word/2006/wordml" mc:Ignorable="w14 w15 w16se w16cid w16 w16cex w16sdtdh w16sdtfl w16du wp14">
+<w:ftr xmlns:wpc="http://schemas.microsoft.com/office/word/2010/wordprocessingCanvas" xmlns:cx="http://schemas.microsoft.com/office/drawing/2014/chartex" xmlns:cx1="http://schemas.microsoft.com/office/drawing/2015/9/8/chartex" xmlns:cx2="http://schemas.microsoft.com/office/drawing/2015/10/21/chartex" xmlns:cx3="http://schemas.microsoft.com/office/drawing/2016/5/9/chartex" xmlns:cx4="http://schemas.microsoft.com/office/drawing/2016/5/10/chartex" xmlns:cx5="http://schemas.microsoft.com/office/drawing/2016/5/11/chartex" xmlns:cx6="http://schemas.microsoft.com/office/drawing/2016/5/12/chartex" xmlns:cx7="http://schemas.microsoft.com/office/drawing/2016/5/13/chartex" xmlns:cx8="http://schemas.microsoft.com/office/drawing/2016/5/14/chartex" xmlns:mc="http://schemas.openxmlformats.org/markup-compatibility/2006" xmlns:m="http://schemas.openxmlformats.org/officeDocument/2006/math" xmlns:aink="http://schemas.microsoft.com/office/drawing/2016/ink" xmlns:am3d="http://schemas.microsoft.com/office/drawing/2017/model3d" xmlns:oel="http://schemas.microsoft.com/office/2019/extlst" xmlns:r="http://schemas.openxmlformats.org/officeDocument/2006/relationships" xmlns:wp14="http://schemas.microsoft.com/office/word/2010/wordprocessingDrawing" xmlns:wp="http://schemas.openxmlformats.org/drawingml/2006/wordprocessingDrawing" xmlns:wpg="http://schemas.microsoft.com/office/word/2010/wordprocessingGroup" xmlns:wpi="http://schemas.microsoft.com/office/word/2010/wordprocessingInk" xmlns:wps="http://schemas.microsoft.com/office/word/2010/wordprocessingShape" xmlns:o="urn:schemas-microsoft-com:office:office" xmlns:v="urn:schemas-microsoft-com:vml" xmlns:w10="urn:schemas-microsoft-com:office:word" xmlns:w="http://schemas.openxmlformats.org/wordprocessingml/2006/main" xmlns:w14="http://schemas.microsoft.com/office/word/2010/wordml" xmlns:w15="http://schemas.microsoft.com/office/word/2012/wordml" xmlns:w16cex="http://schemas.microsoft.com/office/word/2018/wordml/cex" xmlns:w16cid="http://schemas.microsoft.com/office/word/2016/wordml/cid" xmlns:w16="http://schemas.microsoft.com/office/word/2018/wordml" xmlns:w16sdtdh="http://schemas.microsoft.com/office/word/2020/wordml/sdtdatahash" xmlns:w16sdtfl="http://schemas.microsoft.com/office/word/2024/wordml/sdtformatlock" xmlns:w16se="http://schemas.microsoft.com/office/word/2015/wordml/symex" xmlns:w16du="http://schemas.microsoft.com/office/word/2023/wordml/word16du" xmlns:wne="http://schemas.microsoft.com/office/word/2006/wordml" mc:Ignorable="w14 w15 w16se w16cid w16 w16cex w16sdtdh w16sdtfl w16du wp14">
   <w:p>
     <w:pPr>
       <w:pStyle w:val="Footer"/>
@@ -38084,7 +38293,7 @@
 </file>
 
 <file path=word/footnotes.xml><?xml version="1.0" encoding="utf-8"?>
-<w:footnotes xmlns:wpc="http://schemas.microsoft.com/office/word/2010/wordprocessingCanvas" xmlns:cx="http://schemas.microsoft.com/office/drawing/2014/chartex" xmlns:cx1="http://schemas.microsoft.com/office/drawing/2015/9/8/chartex" xmlns:cx2="http://schemas.microsoft.com/office/drawing/2015/10/21/chartex" xmlns:cx3="http://schemas.microsoft.com/office/drawing/2016/5/9/chartex" xmlns:cx4="http://schemas.microsoft.com/office/drawing/2016/5/10/chartex" xmlns:cx5="http://schemas.microsoft.com/office/drawing/2016/5/11/chartex" xmlns:cx6="http://schemas.microsoft.com/office/drawing/2016/5/12/chartex" xmlns:cx7="http://schemas.microsoft.com/office/drawing/2016/5/13/chartex" xmlns:cx8="http://schemas.microsoft.com/office/drawing/2016/5/14/chartex" xmlns:mc="http://schemas.openxmlformats.org/markup-compatibility/2006" xmlns:m="http://schemas.openxmlformats.org/officeDocument/2006/math" xmlns:aink="http://schemas.microsoft.com/office/drawing/2016/ink" xmlns:am3d="http://schemas.microsoft.com/office/drawing/2017/model3d" xmlns:oel="http://schemas.microsoft.com/office/2019/extlst" xmlns:r="http://schemas.openxmlformats.org/officeDocument/2006/relationships" xmlns:wp14="http://schemas.microsoft.com/office/word/2010/wordprocessingDrawing" xmlns:wp="http://schemas.openxmlformats.org/drawingml/2006/wordprocessingDrawing" xmlns:wpg="http://schemas.microsoft.com/office/word/2010/wordprocessingGroup" xmlns:wpi="http://schemas.microsoft.com/office/word/2010/wordprocessingInk" xmlns:wps="http://schemas.microsoft.com/office/word/2010/wordprocessingShape" xmlns:o="urn:schemas-microsoft-com:office:office" xmlns:v="urn:schemas-microsoft-com:vml" xmlns:w10="urn:schemas-microsoft-com:office:word" xmlns:w="http://schemas.openxmlformats.org/wordprocessingml/2006/main" xmlns:w14="http://schemas.microsoft.com/office/word/2010/wordml" xmlns:w15="http://schemas.microsoft.com/office/word/2012/wordml" xmlns:w16cei="http://schemas.microsoft.com/office/word/2026/wordml/cei" xmlns:w16cex="http://schemas.microsoft.com/office/word/2018/wordml/cex" xmlns:w16cid="http://schemas.microsoft.com/office/word/2016/wordml/cid" xmlns:w16="http://schemas.microsoft.com/office/word/2018/wordml" xmlns:w16sdtdh="http://schemas.microsoft.com/office/word/2020/wordml/sdtdatahash" xmlns:w16sdtfl="http://schemas.microsoft.com/office/word/2024/wordml/sdtformatlock" xmlns:w16se="http://schemas.microsoft.com/office/word/2015/wordml/symex" xmlns:w16du="http://schemas.microsoft.com/office/word/2023/wordml/word16du" xmlns:wne="http://schemas.microsoft.com/office/word/2006/wordml" mc:Ignorable="w14 w15 w16se w16cid w16 w16cex w16sdtdh w16sdtfl w16du wp14">
+<w:footnotes xmlns:wpc="http://schemas.microsoft.com/office/word/2010/wordprocessingCanvas" xmlns:cx="http://schemas.microsoft.com/office/drawing/2014/chartex" xmlns:cx1="http://schemas.microsoft.com/office/drawing/2015/9/8/chartex" xmlns:cx2="http://schemas.microsoft.com/office/drawing/2015/10/21/chartex" xmlns:cx3="http://schemas.microsoft.com/office/drawing/2016/5/9/chartex" xmlns:cx4="http://schemas.microsoft.com/office/drawing/2016/5/10/chartex" xmlns:cx5="http://schemas.microsoft.com/office/drawing/2016/5/11/chartex" xmlns:cx6="http://schemas.microsoft.com/office/drawing/2016/5/12/chartex" xmlns:cx7="http://schemas.microsoft.com/office/drawing/2016/5/13/chartex" xmlns:cx8="http://schemas.microsoft.com/office/drawing/2016/5/14/chartex" xmlns:mc="http://schemas.openxmlformats.org/markup-compatibility/2006" xmlns:m="http://schemas.openxmlformats.org/officeDocument/2006/math" xmlns:aink="http://schemas.microsoft.com/office/drawing/2016/ink" xmlns:am3d="http://schemas.microsoft.com/office/drawing/2017/model3d" xmlns:oel="http://schemas.microsoft.com/office/2019/extlst" xmlns:r="http://schemas.openxmlformats.org/officeDocument/2006/relationships" xmlns:wp14="http://schemas.microsoft.com/office/word/2010/wordprocessingDrawing" xmlns:wp="http://schemas.openxmlformats.org/drawingml/2006/wordprocessingDrawing" xmlns:wpg="http://schemas.microsoft.com/office/word/2010/wordprocessingGroup" xmlns:wpi="http://schemas.microsoft.com/office/word/2010/wordprocessingInk" xmlns:wps="http://schemas.microsoft.com/office/word/2010/wordprocessingShape" xmlns:o="urn:schemas-microsoft-com:office:office" xmlns:v="urn:schemas-microsoft-com:vml" xmlns:w10="urn:schemas-microsoft-com:office:word" xmlns:w="http://schemas.openxmlformats.org/wordprocessingml/2006/main" xmlns:w14="http://schemas.microsoft.com/office/word/2010/wordml" xmlns:w15="http://schemas.microsoft.com/office/word/2012/wordml" xmlns:w16cex="http://schemas.microsoft.com/office/word/2018/wordml/cex" xmlns:w16cid="http://schemas.microsoft.com/office/word/2016/wordml/cid" xmlns:w16="http://schemas.microsoft.com/office/word/2018/wordml" xmlns:w16sdtdh="http://schemas.microsoft.com/office/word/2020/wordml/sdtdatahash" xmlns:w16sdtfl="http://schemas.microsoft.com/office/word/2024/wordml/sdtformatlock" xmlns:w16se="http://schemas.microsoft.com/office/word/2015/wordml/symex" xmlns:w16du="http://schemas.microsoft.com/office/word/2023/wordml/word16du" xmlns:wne="http://schemas.microsoft.com/office/word/2006/wordml" mc:Ignorable="w14 w15 w16se w16cid w16 w16cex w16sdtdh w16sdtfl w16du wp14">
   <w:footnote w:type="separator" w:id="-1">
     <w:p>
       <w:r>
@@ -38103,7 +38312,7 @@
 </file>
 
 <file path=word/numbering.xml><?xml version="1.0" encoding="utf-8"?>
-<w:numbering xmlns:wpc="http://schemas.microsoft.com/office/word/2010/wordprocessingCanvas" xmlns:cx="http://schemas.microsoft.com/office/drawing/2014/chartex" xmlns:cx1="http://schemas.microsoft.com/office/drawing/2015/9/8/chartex" xmlns:cx2="http://schemas.microsoft.com/office/drawing/2015/10/21/chartex" xmlns:cx3="http://schemas.microsoft.com/office/drawing/2016/5/9/chartex" xmlns:cx4="http://schemas.microsoft.com/office/drawing/2016/5/10/chartex" xmlns:cx5="http://schemas.microsoft.com/office/drawing/2016/5/11/chartex" xmlns:cx6="http://schemas.microsoft.com/office/drawing/2016/5/12/chartex" xmlns:cx7="http://schemas.microsoft.com/office/drawing/2016/5/13/chartex" xmlns:cx8="http://schemas.microsoft.com/office/drawing/2016/5/14/chartex" xmlns:mc="http://schemas.openxmlformats.org/markup-compatibility/2006" xmlns:m="http://schemas.openxmlformats.org/officeDocument/2006/math" xmlns:aink="http://schemas.microsoft.com/office/drawing/2016/ink" xmlns:am3d="http://schemas.microsoft.com/office/drawing/2017/model3d" xmlns:oel="http://schemas.microsoft.com/office/2019/extlst" xmlns:r="http://schemas.openxmlformats.org/officeDocument/2006/relationships" xmlns:wp14="http://schemas.microsoft.com/office/word/2010/wordprocessingDrawing" xmlns:wp="http://schemas.openxmlformats.org/drawingml/2006/wordprocessingDrawing" xmlns:wpg="http://schemas.microsoft.com/office/word/2010/wordprocessingGroup" xmlns:wpi="http://schemas.microsoft.com/office/word/2010/wordprocessingInk" xmlns:wps="http://schemas.microsoft.com/office/word/2010/wordprocessingShape" xmlns:o="urn:schemas-microsoft-com:office:office" xmlns:v="urn:schemas-microsoft-com:vml" xmlns:w10="urn:schemas-microsoft-com:office:word" xmlns:w="http://schemas.openxmlformats.org/wordprocessingml/2006/main" xmlns:w14="http://schemas.microsoft.com/office/word/2010/wordml" xmlns:w15="http://schemas.microsoft.com/office/word/2012/wordml" xmlns:w16cei="http://schemas.microsoft.com/office/word/2026/wordml/cei" xmlns:w16cex="http://schemas.microsoft.com/office/word/2018/wordml/cex" xmlns:w16cid="http://schemas.microsoft.com/office/word/2016/wordml/cid" xmlns:w16="http://schemas.microsoft.com/office/word/2018/wordml" xmlns:w16sdtdh="http://schemas.microsoft.com/office/word/2020/wordml/sdtdatahash" xmlns:w16sdtfl="http://schemas.microsoft.com/office/word/2024/wordml/sdtformatlock" xmlns:w16se="http://schemas.microsoft.com/office/word/2015/wordml/symex" xmlns:w16du="http://schemas.microsoft.com/office/word/2023/wordml/word16du" xmlns:wne="http://schemas.microsoft.com/office/word/2006/wordml" mc:Ignorable="w14 w15 w16se w16cid w16 w16cex w16sdtdh w16sdtfl w16du wp14">
+<w:numbering xmlns:wpc="http://schemas.microsoft.com/office/word/2010/wordprocessingCanvas" xmlns:cx="http://schemas.microsoft.com/office/drawing/2014/chartex" xmlns:cx1="http://schemas.microsoft.com/office/drawing/2015/9/8/chartex" xmlns:cx2="http://schemas.microsoft.com/office/drawing/2015/10/21/chartex" xmlns:cx3="http://schemas.microsoft.com/office/drawing/2016/5/9/chartex" xmlns:cx4="http://schemas.microsoft.com/office/drawing/2016/5/10/chartex" xmlns:cx5="http://schemas.microsoft.com/office/drawing/2016/5/11/chartex" xmlns:cx6="http://schemas.microsoft.com/office/drawing/2016/5/12/chartex" xmlns:cx7="http://schemas.microsoft.com/office/drawing/2016/5/13/chartex" xmlns:cx8="http://schemas.microsoft.com/office/drawing/2016/5/14/chartex" xmlns:mc="http://schemas.openxmlformats.org/markup-compatibility/2006" xmlns:m="http://schemas.openxmlformats.org/officeDocument/2006/math" xmlns:aink="http://schemas.microsoft.com/office/drawing/2016/ink" xmlns:am3d="http://schemas.microsoft.com/office/drawing/2017/model3d" xmlns:oel="http://schemas.microsoft.com/office/2019/extlst" xmlns:r="http://schemas.openxmlformats.org/officeDocument/2006/relationships" xmlns:wp14="http://schemas.microsoft.com/office/word/2010/wordprocessingDrawing" xmlns:wp="http://schemas.openxmlformats.org/drawingml/2006/wordprocessingDrawing" xmlns:wpg="http://schemas.microsoft.com/office/word/2010/wordprocessingGroup" xmlns:wpi="http://schemas.microsoft.com/office/word/2010/wordprocessingInk" xmlns:wps="http://schemas.microsoft.com/office/word/2010/wordprocessingShape" xmlns:o="urn:schemas-microsoft-com:office:office" xmlns:v="urn:schemas-microsoft-com:vml" xmlns:w10="urn:schemas-microsoft-com:office:word" xmlns:w="http://schemas.openxmlformats.org/wordprocessingml/2006/main" xmlns:w14="http://schemas.microsoft.com/office/word/2010/wordml" xmlns:w15="http://schemas.microsoft.com/office/word/2012/wordml" xmlns:w16cex="http://schemas.microsoft.com/office/word/2018/wordml/cex" xmlns:w16cid="http://schemas.microsoft.com/office/word/2016/wordml/cid" xmlns:w16="http://schemas.microsoft.com/office/word/2018/wordml" xmlns:w16sdtdh="http://schemas.microsoft.com/office/word/2020/wordml/sdtdatahash" xmlns:w16sdtfl="http://schemas.microsoft.com/office/word/2024/wordml/sdtformatlock" xmlns:w16se="http://schemas.microsoft.com/office/word/2015/wordml/symex" xmlns:w16du="http://schemas.microsoft.com/office/word/2023/wordml/word16du" xmlns:wne="http://schemas.microsoft.com/office/word/2006/wordml" mc:Ignorable="w14 w15 w16se w16cid w16 w16cex w16sdtdh w16sdtfl w16du wp14">
   <w:abstractNum w:abstractNumId="0" w15:restartNumberingAfterBreak="0">
     <w:nsid w:val="00000002"/>
     <w:multiLevelType w:val="multilevel"/>

</xml_diff>